<commit_message>
Update manuscript files and statistics for SpecStory project
- Revised user and agent message counts in statistics.json to reflect recent interactions, ensuring accurate tracking of project activity.
- Updated last_updated timestamps in statistics.json for improved accuracy.
- Deleted temporary Word document (~$nuscript_working_outline_v1.docx) to maintain a clean project structure.
- Made minor updates to several PDF documents related to the manuscript, enhancing resource availability for ongoing work.

These changes improve project organization and ensure accurate documentation of user interactions.
</commit_message>
<xml_diff>
--- a/5-Manuscript/Manuscript_working_outline_v1.docx
+++ b/5-Manuscript/Manuscript_working_outline_v1.docx
@@ -162,6 +162,49 @@
       </w:r>
     </w:p>
     <w:p>
+      <w:r>
+        <w:rPr>
+          <w:noProof/>
+        </w:rPr>
+        <w:lastRenderedPageBreak/>
+        <w:drawing>
+          <wp:inline distT="0" distB="0" distL="0" distR="0" wp14:anchorId="16569D52" wp14:editId="2B68ED73">
+            <wp:extent cx="6400800" cy="4768850"/>
+            <wp:effectExtent l="0" t="0" r="0" b="0"/>
+            <wp:docPr id="1336718903" name="Picture 3"/>
+            <wp:cNvGraphicFramePr>
+              <a:graphicFrameLocks xmlns:a="http://schemas.openxmlformats.org/drawingml/2006/main" noChangeAspect="1"/>
+            </wp:cNvGraphicFramePr>
+            <a:graphic xmlns:a="http://schemas.openxmlformats.org/drawingml/2006/main">
+              <a:graphicData uri="http://schemas.openxmlformats.org/drawingml/2006/picture">
+                <pic:pic xmlns:pic="http://schemas.openxmlformats.org/drawingml/2006/picture">
+                  <pic:nvPicPr>
+                    <pic:cNvPr id="1336718903" name="Picture 1336718903"/>
+                    <pic:cNvPicPr/>
+                  </pic:nvPicPr>
+                  <pic:blipFill>
+                    <a:blip r:embed="rId5"/>
+                    <a:stretch>
+                      <a:fillRect/>
+                    </a:stretch>
+                  </pic:blipFill>
+                  <pic:spPr>
+                    <a:xfrm>
+                      <a:off x="0" y="0"/>
+                      <a:ext cx="6400800" cy="4768850"/>
+                    </a:xfrm>
+                    <a:prstGeom prst="rect">
+                      <a:avLst/>
+                    </a:prstGeom>
+                  </pic:spPr>
+                </pic:pic>
+              </a:graphicData>
+            </a:graphic>
+          </wp:inline>
+        </w:drawing>
+      </w:r>
+    </w:p>
+    <w:p>
       <w:pPr>
         <w:pStyle w:val="Heading2"/>
         <w:rPr>
@@ -176,7 +219,6 @@
           <w:b w:val="0"/>
           <w:bCs w:val="0"/>
         </w:rPr>
-        <w:lastRenderedPageBreak/>
         <w:t>2. Why Might This Happen?</w:t>
       </w:r>
     </w:p>
@@ -310,6 +352,7 @@
           <w:b w:val="0"/>
           <w:bCs w:val="0"/>
         </w:rPr>
+        <w:lastRenderedPageBreak/>
         <w:t>3. From Global Competition to Constrained Distinction</w:t>
       </w:r>
     </w:p>
@@ -402,7 +445,6 @@
         <w:br/>
       </w:r>
       <w:r>
-        <w:lastRenderedPageBreak/>
         <w:t>Methodologically, one of the most appealing aspects of the academic setting is that it mirrors an important feature of the Army data. In both systems, individuals may either advance or exit before advancement occurs.</w:t>
       </w:r>
     </w:p>
@@ -439,6 +481,7 @@
           <w:b w:val="0"/>
           <w:bCs w:val="0"/>
         </w:rPr>
+        <w:lastRenderedPageBreak/>
         <w:t>5. Minimal Generative Modeling</w:t>
       </w:r>
     </w:p>
@@ -457,6 +500,46 @@
         <w:br/>
       </w:r>
       <w:r>
+        <w:rPr>
+          <w:noProof/>
+        </w:rPr>
+        <w:drawing>
+          <wp:inline distT="0" distB="0" distL="0" distR="0" wp14:anchorId="10C4CB43" wp14:editId="0DEB7016">
+            <wp:extent cx="6400800" cy="3073400"/>
+            <wp:effectExtent l="0" t="0" r="0" b="0"/>
+            <wp:docPr id="488229714" name="Picture 1"/>
+            <wp:cNvGraphicFramePr>
+              <a:graphicFrameLocks xmlns:a="http://schemas.openxmlformats.org/drawingml/2006/main" noChangeAspect="1"/>
+            </wp:cNvGraphicFramePr>
+            <a:graphic xmlns:a="http://schemas.openxmlformats.org/drawingml/2006/main">
+              <a:graphicData uri="http://schemas.openxmlformats.org/drawingml/2006/picture">
+                <pic:pic xmlns:pic="http://schemas.openxmlformats.org/drawingml/2006/picture">
+                  <pic:nvPicPr>
+                    <pic:cNvPr id="488229714" name="Picture 488229714"/>
+                    <pic:cNvPicPr/>
+                  </pic:nvPicPr>
+                  <pic:blipFill>
+                    <a:blip r:embed="rId6"/>
+                    <a:stretch>
+                      <a:fillRect/>
+                    </a:stretch>
+                  </pic:blipFill>
+                  <pic:spPr>
+                    <a:xfrm>
+                      <a:off x="0" y="0"/>
+                      <a:ext cx="6400800" cy="3073400"/>
+                    </a:xfrm>
+                    <a:prstGeom prst="rect">
+                      <a:avLst/>
+                    </a:prstGeom>
+                  </pic:spPr>
+                </pic:pic>
+              </a:graphicData>
+            </a:graphic>
+          </wp:inline>
+        </w:drawing>
+      </w:r>
+      <w:r>
         <w:br/>
         <w:t>As expected, this talent-only formulation largely produces monotonic outcomes and fails to reproduce the observed downturn.</w:t>
       </w:r>
@@ -471,6 +554,46 @@
         <w:br/>
       </w:r>
       <w:r>
+        <w:rPr>
+          <w:noProof/>
+        </w:rPr>
+        <w:drawing>
+          <wp:inline distT="0" distB="0" distL="0" distR="0" wp14:anchorId="709EBB95" wp14:editId="5D6BB611">
+            <wp:extent cx="6400800" cy="2914015"/>
+            <wp:effectExtent l="0" t="0" r="0" b="0"/>
+            <wp:docPr id="1172005983" name="Picture 2"/>
+            <wp:cNvGraphicFramePr>
+              <a:graphicFrameLocks xmlns:a="http://schemas.openxmlformats.org/drawingml/2006/main" noChangeAspect="1"/>
+            </wp:cNvGraphicFramePr>
+            <a:graphic xmlns:a="http://schemas.openxmlformats.org/drawingml/2006/main">
+              <a:graphicData uri="http://schemas.openxmlformats.org/drawingml/2006/picture">
+                <pic:pic xmlns:pic="http://schemas.openxmlformats.org/drawingml/2006/picture">
+                  <pic:nvPicPr>
+                    <pic:cNvPr id="1172005983" name="Picture 1172005983"/>
+                    <pic:cNvPicPr/>
+                  </pic:nvPicPr>
+                  <pic:blipFill>
+                    <a:blip r:embed="rId7"/>
+                    <a:stretch>
+                      <a:fillRect/>
+                    </a:stretch>
+                  </pic:blipFill>
+                  <pic:spPr>
+                    <a:xfrm>
+                      <a:off x="0" y="0"/>
+                      <a:ext cx="6400800" cy="2914015"/>
+                    </a:xfrm>
+                    <a:prstGeom prst="rect">
+                      <a:avLst/>
+                    </a:prstGeom>
+                  </pic:spPr>
+                </pic:pic>
+              </a:graphicData>
+            </a:graphic>
+          </wp:inline>
+        </w:drawing>
+      </w:r>
+      <w:r>
         <w:br/>
         <w:t>Early generative results suggest that this simple addition is capable of producing peak-and-decline behavior qualitatively similar to the empirical findings.</w:t>
       </w:r>
@@ -478,6 +601,7 @@
         <w:br/>
       </w:r>
       <w:r>
+        <w:lastRenderedPageBreak/>
         <w:br/>
         <w:t>The active modeling challenge is now determining how local comparison environments should be defined and measured and whether this minimal mechanism is sufficient.</w:t>
       </w:r>
@@ -574,7 +698,6 @@
     </w:p>
     <w:p>
       <w:r>
-        <w:lastRenderedPageBreak/>
         <w:br/>
         <w:t>One advantage of this approach is that these mechanisms may be calibrated differently across Army, sports, and academic settings while remaining part of a common conceptual framework.</w:t>
       </w:r>
@@ -699,7 +822,11 @@
     </w:p>
     <w:p>
       <w:r>
-        <w:t>One possibility is that the developmental benefits and competitive constraints identified in this work arise from distinct but related network processes. Exposure networks would capture who individuals learn from, collaborate with, or otherwise benefit from, while comparison networks would capture the peers against whom they are evaluated or implicitly compared. Understanding the relationship between these two networks may provide a more formal representation of the developmental-benefit / competitive-constraint framework.</w:t>
+        <w:t xml:space="preserve">One possibility is that the developmental benefits and competitive constraints identified in this work arise from distinct but related network processes. Exposure networks would capture who individuals learn </w:t>
+      </w:r>
+      <w:r>
+        <w:lastRenderedPageBreak/>
+        <w:t>from, collaborate with, or otherwise benefit from, while comparison networks would capture the peers against whom they are evaluated or implicitly compared. Understanding the relationship between these two networks may provide a more formal representation of the developmental-benefit / competitive-constraint framework.</w:t>
       </w:r>
     </w:p>
     <w:p>
@@ -742,7 +869,6 @@
         <w:spacing w:after="0"/>
       </w:pPr>
       <w:r>
-        <w:lastRenderedPageBreak/>
         <w:t>A more speculative direction is to move beyond local talent concentration itself and consider an individual's position relative to concentrated regions of talent within a broader network. In military, academic, or athletic settings, proximity to highly connected or highly capable individuals may influence developmental opportunities, visibility, and long-term advancement outcomes. This would shift the focus from "How talented are my immediate peers?" toward "Where am I positioned relative to talent within the system?"</w:t>
       </w:r>
     </w:p>
@@ -928,6 +1054,7 @@
         <w:spacing w:after="0"/>
       </w:pPr>
       <w:r>
+        <w:lastRenderedPageBreak/>
         <w:t>• Connections to existing work on careers, success, prestige, cumulative advantage, or scientific advancement.</w:t>
       </w:r>
     </w:p>
@@ -1360,13 +1487,57 @@
     <w:lsdException w:name="HTML Sample" w:semiHidden="1" w:unhideWhenUsed="1"/>
     <w:lsdException w:name="HTML Typewriter" w:semiHidden="1" w:unhideWhenUsed="1"/>
     <w:lsdException w:name="HTML Variable" w:semiHidden="1" w:unhideWhenUsed="1"/>
+    <w:lsdException w:name="Normal Table" w:semiHidden="1" w:unhideWhenUsed="1"/>
     <w:lsdException w:name="annotation subject" w:semiHidden="1" w:unhideWhenUsed="1"/>
     <w:lsdException w:name="No List" w:semiHidden="1" w:unhideWhenUsed="1"/>
     <w:lsdException w:name="Outline List 1" w:semiHidden="1" w:unhideWhenUsed="1"/>
     <w:lsdException w:name="Outline List 2" w:semiHidden="1" w:unhideWhenUsed="1"/>
     <w:lsdException w:name="Outline List 3" w:semiHidden="1" w:unhideWhenUsed="1"/>
+    <w:lsdException w:name="Table Simple 1" w:semiHidden="1" w:unhideWhenUsed="1"/>
+    <w:lsdException w:name="Table Simple 2" w:semiHidden="1" w:unhideWhenUsed="1"/>
+    <w:lsdException w:name="Table Simple 3" w:semiHidden="1" w:unhideWhenUsed="1"/>
+    <w:lsdException w:name="Table Classic 1" w:semiHidden="1" w:unhideWhenUsed="1"/>
+    <w:lsdException w:name="Table Classic 2" w:semiHidden="1" w:unhideWhenUsed="1"/>
+    <w:lsdException w:name="Table Classic 3" w:semiHidden="1" w:unhideWhenUsed="1"/>
+    <w:lsdException w:name="Table Classic 4" w:semiHidden="1" w:unhideWhenUsed="1"/>
+    <w:lsdException w:name="Table Colorful 1" w:semiHidden="1" w:unhideWhenUsed="1"/>
+    <w:lsdException w:name="Table Colorful 2" w:semiHidden="1" w:unhideWhenUsed="1"/>
+    <w:lsdException w:name="Table Colorful 3" w:semiHidden="1" w:unhideWhenUsed="1"/>
+    <w:lsdException w:name="Table Columns 1" w:semiHidden="1" w:unhideWhenUsed="1"/>
+    <w:lsdException w:name="Table Columns 2" w:semiHidden="1" w:unhideWhenUsed="1"/>
+    <w:lsdException w:name="Table Columns 3" w:semiHidden="1" w:unhideWhenUsed="1"/>
+    <w:lsdException w:name="Table Columns 4" w:semiHidden="1" w:unhideWhenUsed="1"/>
+    <w:lsdException w:name="Table Columns 5" w:semiHidden="1" w:unhideWhenUsed="1"/>
+    <w:lsdException w:name="Table Grid 1" w:semiHidden="1" w:unhideWhenUsed="1"/>
+    <w:lsdException w:name="Table Grid 2" w:semiHidden="1" w:unhideWhenUsed="1"/>
+    <w:lsdException w:name="Table Grid 3" w:semiHidden="1" w:unhideWhenUsed="1"/>
+    <w:lsdException w:name="Table Grid 4" w:semiHidden="1" w:unhideWhenUsed="1"/>
+    <w:lsdException w:name="Table Grid 5" w:semiHidden="1" w:unhideWhenUsed="1"/>
+    <w:lsdException w:name="Table Grid 6" w:semiHidden="1" w:unhideWhenUsed="1"/>
+    <w:lsdException w:name="Table Grid 7" w:semiHidden="1" w:unhideWhenUsed="1"/>
+    <w:lsdException w:name="Table Grid 8" w:semiHidden="1" w:unhideWhenUsed="1"/>
+    <w:lsdException w:name="Table List 1" w:semiHidden="1" w:unhideWhenUsed="1"/>
+    <w:lsdException w:name="Table List 2" w:semiHidden="1" w:unhideWhenUsed="1"/>
+    <w:lsdException w:name="Table List 3" w:semiHidden="1" w:unhideWhenUsed="1"/>
+    <w:lsdException w:name="Table List 4" w:semiHidden="1" w:unhideWhenUsed="1"/>
+    <w:lsdException w:name="Table List 5" w:semiHidden="1" w:unhideWhenUsed="1"/>
+    <w:lsdException w:name="Table List 6" w:semiHidden="1" w:unhideWhenUsed="1"/>
+    <w:lsdException w:name="Table List 7" w:semiHidden="1" w:unhideWhenUsed="1"/>
+    <w:lsdException w:name="Table List 8" w:semiHidden="1" w:unhideWhenUsed="1"/>
+    <w:lsdException w:name="Table 3D effects 1" w:semiHidden="1" w:unhideWhenUsed="1"/>
+    <w:lsdException w:name="Table 3D effects 2" w:semiHidden="1" w:unhideWhenUsed="1"/>
+    <w:lsdException w:name="Table 3D effects 3" w:semiHidden="1" w:unhideWhenUsed="1"/>
+    <w:lsdException w:name="Table Contemporary" w:semiHidden="1" w:unhideWhenUsed="1"/>
+    <w:lsdException w:name="Table Elegant" w:semiHidden="1" w:unhideWhenUsed="1"/>
+    <w:lsdException w:name="Table Professional" w:semiHidden="1" w:unhideWhenUsed="1"/>
+    <w:lsdException w:name="Table Subtle 1" w:semiHidden="1" w:unhideWhenUsed="1"/>
+    <w:lsdException w:name="Table Subtle 2" w:semiHidden="1" w:unhideWhenUsed="1"/>
+    <w:lsdException w:name="Table Web 1" w:semiHidden="1" w:unhideWhenUsed="1"/>
+    <w:lsdException w:name="Table Web 2" w:semiHidden="1" w:unhideWhenUsed="1"/>
+    <w:lsdException w:name="Table Web 3" w:semiHidden="1" w:unhideWhenUsed="1"/>
     <w:lsdException w:name="Balloon Text" w:semiHidden="1" w:unhideWhenUsed="1"/>
     <w:lsdException w:name="Table Grid" w:uiPriority="59"/>
+    <w:lsdException w:name="Table Theme" w:semiHidden="1" w:unhideWhenUsed="1"/>
     <w:lsdException w:name="Placeholder Text" w:semiHidden="1"/>
     <w:lsdException w:name="No Spacing" w:uiPriority="1" w:qFormat="1"/>
     <w:lsdException w:name="Light Shading" w:uiPriority="60"/>

</xml_diff>